<commit_message>
Replace the poker winnings figure in 28 cover letters with the Kelly teaching
The sales and trading, hedge fund, proprietary trading and Optiver letters
no longer quote lifetime poker winnings. Each now describes the process
instead: sizing stakes with the Kelly criterion while keeping at least 50
buy-ins in case the edge was overestimated, and teaching new Poker
Society members to work out how many buy-ins their own win rate,
variance and risk tolerance call for. The prop-trading letters also call
the £600 a budget per semester. Word files, PDFs and the three combined
documents are updated; every letter still fits on one page.

Co-Authored-By: Claude Opus 5.5 <noreply@anthropic.com>
Claude-Session: https://claude.ai/code/session_014UttY6X58fJUvgpoQo1i1g
</commit_message>
<xml_diff>
--- a/applications/Will_McGowan_All_70_Cover_Letters_2027.docx
+++ b/applications/Will_McGowan_All_70_Cover_Letters_2027.docx
@@ -9555,7 +9555,7 @@
         <w:rPr>
           <w:b w:val="0"/>
         </w:rPr>
-        <w:t>Sales and trading appeals to me because it joins analysis to a live price and to a client who needs a clear answer quickly. Writing those weekly notes taught me to turn analysis into a view that non-specialists can act on. In nearly two years at KONG, I learned that a recommendation lands only when it fits the person hearing it: by analysing sales patterns and refining our upselling prompts, I raised average customer spend by an estimated 25%. I also take risk seriously; my lifetime poker winnings of over £40,000 were built on disciplined bet sizing and a strict bankroll rule.</w:t>
+        <w:t>Sales and trading appeals to me because it joins analysis to a live price and to a client who needs a clear answer quickly. Writing those weekly notes taught me to turn analysis into a view that non-specialists can act on. In nearly two years at KONG, I learned that a recommendation lands only when it fits the person hearing it: by analysing sales patterns and refining our upselling prompts, I raised average customer spend by an estimated 25%. I also take risk seriously: at the Strathclyde Poker Society, where I was Vice-President and then President, I taught new members to use the Kelly criterion to work out how many buy-ins their own win rate, variance and appetite for risk call for.</w:t>
       </w:r>
     </w:p>
     <w:p>
@@ -9823,7 +9823,7 @@
         <w:rPr>
           <w:b w:val="0"/>
         </w:rPr>
-        <w:t>Sales and trading appeals to me because it joins analysis to a live price and to a client who needs a clear answer quickly. Writing those weekly notes taught me to turn analysis into a view that non-specialists can act on. In nearly two years at KONG, I learned that a recommendation lands only when it fits the person hearing it: by analysing sales patterns and refining our upselling prompts, I raised average customer spend by an estimated 25%. I also take risk seriously; my lifetime poker winnings of over £40,000 were built on disciplined bet sizing and a strict bankroll rule.</w:t>
+        <w:t>Sales and trading appeals to me because it joins analysis to a live price and to a client who needs a clear answer quickly. Writing those weekly notes taught me to turn analysis into a view that non-specialists can act on. In nearly two years at KONG, I learned that a recommendation lands only when it fits the person hearing it: by analysing sales patterns and refining our upselling prompts, I raised average customer spend by an estimated 25%. I also take risk seriously: at the Strathclyde Poker Society, where I was Vice-President and then President, I taught new members to use the Kelly criterion to work out how many buy-ins their own win rate, variance and appetite for risk call for.</w:t>
       </w:r>
     </w:p>
     <w:p>
@@ -10091,7 +10091,7 @@
         <w:rPr>
           <w:b w:val="0"/>
         </w:rPr>
-        <w:t>Sales and trading appeals to me because it joins analysis to a live price and to a client who needs a clear answer quickly. Writing those weekly notes taught me to turn analysis into a view that non-specialists can act on. In nearly two years at KONG, I learned that a recommendation lands only when it fits the person hearing it: by analysing sales patterns and refining our upselling prompts, I raised average customer spend by an estimated 25%. I also take risk seriously; my lifetime poker winnings of over £40,000 were built on disciplined bet sizing and a strict bankroll rule.</w:t>
+        <w:t>Sales and trading appeals to me because it joins analysis to a live price and to a client who needs a clear answer quickly. Writing those weekly notes taught me to turn analysis into a view that non-specialists can act on. In nearly two years at KONG, I learned that a recommendation lands only when it fits the person hearing it: by analysing sales patterns and refining our upselling prompts, I raised average customer spend by an estimated 25%. I also take risk seriously: at the Strathclyde Poker Society, where I was Vice-President and then President, I taught new members to use the Kelly criterion to work out how many buy-ins their own win rate, variance and appetite for risk call for.</w:t>
       </w:r>
     </w:p>
     <w:p>
@@ -10359,7 +10359,7 @@
         <w:rPr>
           <w:b w:val="0"/>
         </w:rPr>
-        <w:t>Sales and trading appeals to me because it joins analysis to a live price and to a client who needs a clear answer quickly. Writing those weekly notes taught me to turn analysis into a view that non-specialists can act on. In nearly two years at KONG, I learned that a recommendation lands only when it fits the person hearing it: by analysing sales patterns and refining our upselling prompts, I raised average customer spend by an estimated 25%. I also take risk seriously; my lifetime poker winnings of over £40,000 were built on disciplined bet sizing and a strict bankroll rule.</w:t>
+        <w:t>Sales and trading appeals to me because it joins analysis to a live price and to a client who needs a clear answer quickly. Writing those weekly notes taught me to turn analysis into a view that non-specialists can act on. In nearly two years at KONG, I learned that a recommendation lands only when it fits the person hearing it: by analysing sales patterns and refining our upselling prompts, I raised average customer spend by an estimated 25%. I also take risk seriously: at the Strathclyde Poker Society, where I was Vice-President and then President, I taught new members to use the Kelly criterion to work out how many buy-ins their own win rate, variance and appetite for risk call for.</w:t>
       </w:r>
     </w:p>
     <w:p>
@@ -10627,7 +10627,7 @@
         <w:rPr>
           <w:b w:val="0"/>
         </w:rPr>
-        <w:t>Sales and trading appeals to me because it joins analysis to a live price and to a client who needs a clear answer quickly. Writing those weekly notes taught me to turn analysis into a view that non-specialists can act on. In nearly two years at KONG, I learned that a recommendation lands only when it fits the person hearing it: by analysing sales patterns and refining our upselling prompts, I raised average customer spend by an estimated 25%. I also take risk seriously; my lifetime poker winnings of over £40,000 were built on disciplined bet sizing and a strict bankroll rule.</w:t>
+        <w:t>Sales and trading appeals to me because it joins analysis to a live price and to a client who needs a clear answer quickly. Writing those weekly notes taught me to turn analysis into a view that non-specialists can act on. In nearly two years at KONG, I learned that a recommendation lands only when it fits the person hearing it: by analysing sales patterns and refining our upselling prompts, I raised average customer spend by an estimated 25%. I also take risk seriously: at the Strathclyde Poker Society, where I was Vice-President and then President, I taught new members to use the Kelly criterion to work out how many buy-ins their own win rate, variance and appetite for risk call for.</w:t>
       </w:r>
     </w:p>
     <w:p>
@@ -10884,7 +10884,7 @@
         <w:rPr>
           <w:b w:val="0"/>
         </w:rPr>
-        <w:t>Hedge funds appeal to me because the distance between an idea and its consequences is short: a research view becomes a position, and the position is marked every day. I take that accountability seriously. My lifetime poker winnings of over £40,000 came from respecting variance and sizing risk to a strict 50-buy-in bankroll rule, and as Treasurer of the Agricapital Society, which I helped grow to 126 members, I manage its budget and accounts.</w:t>
+        <w:t>Hedge funds appeal to me because the distance between an idea and its consequences is short: a research view becomes a position, and the position is marked every day. I take that accountability seriously. As Vice-President and then President of the Strathclyde Poker Society, I taught new members to use the Kelly criterion to work out how many buy-ins their win rate, variance and risk tolerance call for, with a buffer because their edge is only an estimate; a position sized on an uncertain alpha needs the same caution. As Treasurer of the Agricapital Society, which I helped grow to 126 members, I manage its budget and accounts.</w:t>
       </w:r>
     </w:p>
     <w:p>
@@ -11141,7 +11141,7 @@
         <w:rPr>
           <w:b w:val="0"/>
         </w:rPr>
-        <w:t>Hedge funds appeal to me because the distance between an idea and its consequences is short: a research view becomes a position, and the position is marked every day. I take that accountability seriously. My lifetime poker winnings of over £40,000 came from respecting variance and sizing risk to a strict 50-buy-in bankroll rule, and as Treasurer of the Agricapital Society, which I helped grow to 126 members, I manage its budget and accounts.</w:t>
+        <w:t>Hedge funds appeal to me because the distance between an idea and its consequences is short: a research view becomes a position, and the position is marked every day. I take that accountability seriously. As Vice-President and then President of the Strathclyde Poker Society, I taught new members to use the Kelly criterion to work out how many buy-ins their win rate, variance and risk tolerance call for, with a buffer because their edge is only an estimate; a position sized on an uncertain alpha needs the same caution. As Treasurer of the Agricapital Society, which I helped grow to 126 members, I manage its budget and accounts.</w:t>
       </w:r>
     </w:p>
     <w:p>
@@ -11409,7 +11409,7 @@
         <w:rPr>
           <w:b w:val="0"/>
         </w:rPr>
-        <w:t>Hedge funds appeal to me because the distance between an idea and its consequences is short: a research view becomes a position, and the position is marked every day. I take that accountability seriously. My lifetime poker winnings of over £40,000 came from respecting variance and sizing risk to a strict 50-buy-in bankroll rule, and as Treasurer of the Agricapital Society, which I helped grow to 126 members, I manage its budget and accounts.</w:t>
+        <w:t>Hedge funds appeal to me because the distance between an idea and its consequences is short: a research view becomes a position, and the position is marked every day. I take that accountability seriously. As Vice-President and then President of the Strathclyde Poker Society, I taught new members to use the Kelly criterion to work out how many buy-ins their win rate, variance and risk tolerance call for, with a buffer because their edge is only an estimate; a position sized on an uncertain alpha needs the same caution. As Treasurer of the Agricapital Society, which I helped grow to 126 members, I manage its budget and accounts.</w:t>
       </w:r>
     </w:p>
     <w:p>
@@ -11677,7 +11677,7 @@
         <w:rPr>
           <w:b w:val="0"/>
         </w:rPr>
-        <w:t>Hedge funds appeal to me because the distance between an idea and its consequences is short: a research view becomes a position, and the position is marked every day. I take that accountability seriously. My lifetime poker winnings of over £40,000 came from respecting variance and sizing risk to a strict 50-buy-in bankroll rule, and as Treasurer of the Agricapital Society, which I helped grow to 126 members, I manage its budget and accounts.</w:t>
+        <w:t>Hedge funds appeal to me because the distance between an idea and its consequences is short: a research view becomes a position, and the position is marked every day. I take that accountability seriously. As Vice-President and then President of the Strathclyde Poker Society, I taught new members to use the Kelly criterion to work out how many buy-ins their win rate, variance and risk tolerance call for, with a buffer because their edge is only an estimate; a position sized on an uncertain alpha needs the same caution. As Treasurer of the Agricapital Society, which I helped grow to 126 members, I manage its budget and accounts.</w:t>
       </w:r>
     </w:p>
     <w:p>
@@ -11934,7 +11934,7 @@
         <w:rPr>
           <w:b w:val="0"/>
         </w:rPr>
-        <w:t>Hedge funds appeal to me because the distance between an idea and its consequences is short: a research view becomes a position, and the position is marked every day. I take that accountability seriously. My lifetime poker winnings of over £40,000 came from respecting variance and sizing risk to a strict 50-buy-in bankroll rule, and as Treasurer of the Agricapital Society, which I helped grow to 126 members, I manage its budget and accounts.</w:t>
+        <w:t>Hedge funds appeal to me because the distance between an idea and its consequences is short: a research view becomes a position, and the position is marked every day. I take that accountability seriously. As Vice-President and then President of the Strathclyde Poker Society, I taught new members to use the Kelly criterion to work out how many buy-ins their win rate, variance and risk tolerance call for, with a buffer because their edge is only an estimate; a position sized on an uncertain alpha needs the same caution. As Treasurer of the Agricapital Society, which I helped grow to 126 members, I manage its budget and accounts.</w:t>
       </w:r>
     </w:p>
     <w:p>
@@ -12180,7 +12180,7 @@
         <w:rPr>
           <w:b w:val="0"/>
         </w:rPr>
-        <w:t>I am applying for the Quantitative Trader – Graduate: 2027 role in London. I am a final-year Economics student at the University of Strathclyde, graduating in summer 2027 with a predicted 2:1. Susquehanna's training in game theory and decision-making under uncertainty appeals to me because those are the skills behind my results at the poker table.</w:t>
+        <w:t>I am applying for the Quantitative Trader – Graduate: 2027 role in London. I am a final-year Economics student at the University of Strathclyde, graduating in summer 2027 with a predicted 2:1. Susquehanna's training in game theory and decision-making under uncertainty appeals to me because those are the skills I rely on at the poker table.</w:t>
       </w:r>
     </w:p>
     <w:p>
@@ -12191,7 +12191,7 @@
         <w:rPr>
           <w:b w:val="0"/>
         </w:rPr>
-        <w:t>Most of what I am proudest of comes down to good decisions made with incomplete information. My lifetime poker cash-game winnings of over £40,000 came from expected-value reasoning, disciplined bet sizing and a strict 50-buy-in bankroll rule. I also finished 14th at the Irish U19 Chess Championships in 2023 and won 21 of 22 games in a simultaneous exhibition against players with an average FIDE rating of 1860. As Vice-President and then President of the Strathclyde Poker Society, I ran weekly tournaments for around 60 players on a £600-per-semester budget, reconciling every buy-in and prize pool.</w:t>
+        <w:t>Most of what I am proudest of comes down to good decisions made with incomplete information. Playing 12 poker tables at once, I based every decision on expected value and set my stakes with the Kelly criterion, keeping at least 50 buy-ins because an edge estimated from my own results could be overstated. I also finished 14th at the Irish U19 Chess Championships in 2023 and won 21 of 22 games in a simultaneous exhibition against players with an average FIDE rating of 1860. As Vice-President and then President of the Strathclyde Poker Society, I ran weekly tournaments for around 60 players on a £600 budget per semester and taught new members to use the same method to work out how many buy-ins their own win rate, variance and risk tolerance call for.</w:t>
       </w:r>
     </w:p>
     <w:p>
@@ -12459,7 +12459,7 @@
         <w:rPr>
           <w:b w:val="0"/>
         </w:rPr>
-        <w:t>Most of what I am proudest of comes down to good decisions made with incomplete information. My lifetime poker cash-game winnings of over £40,000 came from expected-value reasoning, disciplined bet sizing and a strict 50-buy-in bankroll rule. I also finished 14th at the Irish U19 Chess Championships in 2023 and won 21 of 22 games in a simultaneous exhibition against players with an average FIDE rating of 1860. As Vice-President and then President of the Strathclyde Poker Society, I ran weekly tournaments for around 60 players on a £600-per-semester budget, reconciling every buy-in and prize pool.</w:t>
+        <w:t>Most of what I am proudest of comes down to good decisions made with incomplete information. Playing 12 poker tables at once, I based every decision on expected value and set my stakes with the Kelly criterion, keeping at least 50 buy-ins because an edge estimated from my own results could be overstated. I also finished 14th at the Irish U19 Chess Championships in 2023 and won 21 of 22 games in a simultaneous exhibition against players with an average FIDE rating of 1860. As Vice-President and then President of the Strathclyde Poker Society, I ran weekly tournaments for around 60 players on a £600 budget per semester and taught new members to use the same method to work out how many buy-ins their own win rate, variance and risk tolerance call for.</w:t>
       </w:r>
     </w:p>
     <w:p>
@@ -12727,7 +12727,7 @@
         <w:rPr>
           <w:b w:val="0"/>
         </w:rPr>
-        <w:t>Most of what I am proudest of comes down to good decisions made with incomplete information. My lifetime poker cash-game winnings of over £40,000 came from expected-value reasoning, disciplined bet sizing and a strict 50-buy-in bankroll rule. I also finished 14th at the Irish U19 Chess Championships in 2023 and won 21 of 22 games in a simultaneous exhibition against players with an average FIDE rating of 1860. As Vice-President and then President of the Strathclyde Poker Society, I ran weekly tournaments for around 60 players on a £600-per-semester budget, reconciling every buy-in and prize pool.</w:t>
+        <w:t>Most of what I am proudest of comes down to good decisions made with incomplete information. Playing 12 poker tables at once, I based every decision on expected value and set my stakes with the Kelly criterion, keeping at least 50 buy-ins because an edge estimated from my own results could be overstated. I also finished 14th at the Irish U19 Chess Championships in 2023 and won 21 of 22 games in a simultaneous exhibition against players with an average FIDE rating of 1860. As Vice-President and then President of the Strathclyde Poker Society, I ran weekly tournaments for around 60 players on a £600 budget per semester and taught new members to use the same method to work out how many buy-ins their own win rate, variance and risk tolerance call for.</w:t>
       </w:r>
     </w:p>
     <w:p>
@@ -12984,7 +12984,7 @@
         <w:rPr>
           <w:b w:val="0"/>
         </w:rPr>
-        <w:t>Most of what I am proudest of comes down to good decisions made with incomplete information. My lifetime poker cash-game winnings of over £40,000 came from expected-value reasoning, disciplined bet sizing and a strict 50-buy-in bankroll rule. I also finished 14th at the Irish U19 Chess Championships in 2023 and won 21 of 22 games in a simultaneous exhibition against players with an average FIDE rating of 1860. As Vice-President and then President of the Strathclyde Poker Society, I ran weekly tournaments for around 60 players on a £600-per-semester budget, reconciling every buy-in and prize pool.</w:t>
+        <w:t>Most of what I am proudest of comes down to good decisions made with incomplete information. Playing 12 poker tables at once, I based every decision on expected value and set my stakes with the Kelly criterion, keeping at least 50 buy-ins because an edge estimated from my own results could be overstated. I also finished 14th at the Irish U19 Chess Championships in 2023 and won 21 of 22 games in a simultaneous exhibition against players with an average FIDE rating of 1860. As Vice-President and then President of the Strathclyde Poker Society, I ran weekly tournaments for around 60 players on a £600 budget per semester and taught new members to use the same method to work out how many buy-ins their own win rate, variance and risk tolerance call for.</w:t>
       </w:r>
     </w:p>
     <w:p>
@@ -13263,7 +13263,7 @@
         <w:rPr>
           <w:b w:val="0"/>
         </w:rPr>
-        <w:t>Quantitative research appeals to me because it is honest: an idea only counts if it survives data it has not seen. Poker taught me the same respect for variance; my lifetime cash-game winnings of over £40,000 came from disciplined bet sizing and a strict 50-buy-in bankroll rule rather than any single good night. I brought that discipline to the Strathclyde Agricapital Society, which I co-founded and grew to 126 members, where I built a wheat calendar-spread strategy whose weekly backtest returned a Sharpe ratio of 0.76 before costs and 0.28 after.</w:t>
+        <w:t>Quantitative research appeals to me because it is honest: an idea only counts if it survives data it has not seen. Poker taught me the same respect for variance: playing 12 cash-game tables at once, I set my stakes with the Kelly criterion but kept at least 50 buy-ins in case I had overestimated my edge, and at the Strathclyde Poker Society I taught new members to size their own bankrolls the same way. I brought that discipline to the Strathclyde Agricapital Society, which I co-founded and grew to 126 members, where I built a wheat calendar-spread strategy whose weekly backtest returned a Sharpe ratio of 0.76 before costs and 0.28 after.</w:t>
       </w:r>
     </w:p>
     <w:p>
@@ -18847,7 +18847,7 @@
         <w:rPr>
           <w:b w:val="0"/>
         </w:rPr>
-        <w:t>Sales and trading appeals to me because it joins analysis to a live price and to a client who needs a clear answer quickly. Writing those weekly notes taught me to turn analysis into a view that non-specialists can act on. In nearly two years at KONG, I learned that a recommendation lands only when it fits the person hearing it: by analysing sales patterns and refining our upselling prompts, I raised average customer spend by an estimated 25%. I also take risk seriously; my lifetime poker winnings of over £40,000 were built on disciplined bet sizing and a strict bankroll rule.</w:t>
+        <w:t>Sales and trading appeals to me because it joins analysis to a live price and to a client who needs a clear answer quickly. Writing those weekly notes taught me to turn analysis into a view that non-specialists can act on. In nearly two years at KONG, I learned that a recommendation lands only when it fits the person hearing it: by analysing sales patterns and refining our upselling prompts, I raised average customer spend by an estimated 25%. I also take risk seriously: at the Strathclyde Poker Society, where I was Vice-President and then President, I taught new members to use the Kelly criterion to work out how many buy-ins their own win rate, variance and appetite for risk call for.</w:t>
       </w:r>
     </w:p>
     <w:p>
@@ -19115,7 +19115,7 @@
         <w:rPr>
           <w:b w:val="0"/>
         </w:rPr>
-        <w:t>Sales and trading appeals to me because it joins analysis to a live price and to a client who needs a clear answer quickly. Writing those weekly notes taught me to turn analysis into a view that non-specialists can act on. In nearly two years at KONG, I learned that a recommendation lands only when it fits the person hearing it: by analysing sales patterns and refining our upselling prompts, I raised average customer spend by an estimated 25%. I also take risk seriously; my lifetime poker winnings of over £40,000 were built on disciplined bet sizing and a strict bankroll rule.</w:t>
+        <w:t>Sales and trading appeals to me because it joins analysis to a live price and to a client who needs a clear answer quickly. Writing those weekly notes taught me to turn analysis into a view that non-specialists can act on. In nearly two years at KONG, I learned that a recommendation lands only when it fits the person hearing it: by analysing sales patterns and refining our upselling prompts, I raised average customer spend by an estimated 25%. I also take risk seriously: at the Strathclyde Poker Society, where I was Vice-President and then President, I taught new members to use the Kelly criterion to work out how many buy-ins their own win rate, variance and appetite for risk call for.</w:t>
       </w:r>
     </w:p>
     <w:p>
@@ -19383,7 +19383,7 @@
         <w:rPr>
           <w:b w:val="0"/>
         </w:rPr>
-        <w:t>Sales and trading appeals to me because it joins analysis to a live price and to a client who needs a clear answer quickly. Writing those weekly notes taught me to turn analysis into a view that non-specialists can act on. In nearly two years at KONG, I learned that a recommendation lands only when it fits the person hearing it: by analysing sales patterns and refining our upselling prompts, I raised average customer spend by an estimated 25%. I also take risk seriously; my lifetime poker winnings of over £40,000 were built on disciplined bet sizing and a strict bankroll rule.</w:t>
+        <w:t>Sales and trading appeals to me because it joins analysis to a live price and to a client who needs a clear answer quickly. Writing those weekly notes taught me to turn analysis into a view that non-specialists can act on. In nearly two years at KONG, I learned that a recommendation lands only when it fits the person hearing it: by analysing sales patterns and refining our upselling prompts, I raised average customer spend by an estimated 25%. I also take risk seriously: at the Strathclyde Poker Society, where I was Vice-President and then President, I taught new members to use the Kelly criterion to work out how many buy-ins their own win rate, variance and appetite for risk call for.</w:t>
       </w:r>
     </w:p>
     <w:p>
@@ -19651,7 +19651,7 @@
         <w:rPr>
           <w:b w:val="0"/>
         </w:rPr>
-        <w:t>Sales and trading appeals to me because it joins analysis to a live price and to a client who needs a clear answer quickly. Writing those weekly notes taught me to turn analysis into a view that non-specialists can act on. In nearly two years at KONG, I learned that a recommendation lands only when it fits the person hearing it: by analysing sales patterns and refining our upselling prompts, I raised average customer spend by an estimated 25%. I also take risk seriously; my lifetime poker winnings of over £40,000 were built on disciplined bet sizing and a strict bankroll rule.</w:t>
+        <w:t>Sales and trading appeals to me because it joins analysis to a live price and to a client who needs a clear answer quickly. Writing those weekly notes taught me to turn analysis into a view that non-specialists can act on. In nearly two years at KONG, I learned that a recommendation lands only when it fits the person hearing it: by analysing sales patterns and refining our upselling prompts, I raised average customer spend by an estimated 25%. I also take risk seriously: at the Strathclyde Poker Society, where I was Vice-President and then President, I taught new members to use the Kelly criterion to work out how many buy-ins their own win rate, variance and appetite for risk call for.</w:t>
       </w:r>
     </w:p>
     <w:p>
@@ -19908,7 +19908,7 @@
         <w:rPr>
           <w:b w:val="0"/>
         </w:rPr>
-        <w:t>Sales and trading appeals to me because it joins analysis to a live price and to a client who needs a clear answer quickly. Writing those weekly notes taught me to turn analysis into a view that non-specialists can act on. In nearly two years at KONG, I learned that a recommendation lands only when it fits the person hearing it: by analysing sales patterns and refining our upselling prompts, I raised average customer spend by an estimated 25%. I also take risk seriously; my lifetime poker winnings of over £40,000 were built on disciplined bet sizing and a strict bankroll rule.</w:t>
+        <w:t>Sales and trading appeals to me because it joins analysis to a live price and to a client who needs a clear answer quickly. Writing those weekly notes taught me to turn analysis into a view that non-specialists can act on. In nearly two years at KONG, I learned that a recommendation lands only when it fits the person hearing it: by analysing sales patterns and refining our upselling prompts, I raised average customer spend by an estimated 25%. I also take risk seriously: at the Strathclyde Poker Society, where I was Vice-President and then President, I taught new members to use the Kelly criterion to work out how many buy-ins their own win rate, variance and appetite for risk call for.</w:t>
       </w:r>
     </w:p>
     <w:p>
@@ -20165,7 +20165,7 @@
         <w:rPr>
           <w:b w:val="0"/>
         </w:rPr>
-        <w:t>Hedge funds appeal to me because the distance between an idea and its consequences is short: a research view becomes a position, and the position is marked every day. I take that accountability seriously. My lifetime poker winnings of over £40,000 came from respecting variance and sizing risk to a strict 50-buy-in bankroll rule, and as Treasurer of the Agricapital Society, which I helped grow to 126 members, I manage its budget and accounts.</w:t>
+        <w:t>Hedge funds appeal to me because the distance between an idea and its consequences is short: a research view becomes a position, and the position is marked every day. I take that accountability seriously. As Vice-President and then President of the Strathclyde Poker Society, I taught new members to use the Kelly criterion to work out how many buy-ins their win rate, variance and risk tolerance call for, with a buffer because their edge is only an estimate; a position sized on an uncertain alpha needs the same caution. As Treasurer of the Agricapital Society, which I helped grow to 126 members, I manage its budget and accounts.</w:t>
       </w:r>
     </w:p>
     <w:p>
@@ -20958,7 +20958,7 @@
         <w:rPr>
           <w:b w:val="0"/>
         </w:rPr>
-        <w:t>Hedge funds appeal to me because the distance between an idea and its consequences is short: a research view becomes a position, and the position is marked every day. I take that accountability seriously. My lifetime poker winnings of over £40,000 came from respecting variance and sizing risk to a strict 50-buy-in bankroll rule, and as Treasurer of the Agricapital Society, which I helped grow to 126 members, I manage its budget and accounts.</w:t>
+        <w:t>Hedge funds appeal to me because the distance between an idea and its consequences is short: a research view becomes a position, and the position is marked every day. I take that accountability seriously. As Vice-President and then President of the Strathclyde Poker Society, I taught new members to use the Kelly criterion to work out how many buy-ins their win rate, variance and risk tolerance call for, with a buffer because their edge is only an estimate; a position sized on an uncertain alpha needs the same caution. As Treasurer of the Agricapital Society, which I helped grow to 126 members, I manage its budget and accounts.</w:t>
       </w:r>
     </w:p>
     <w:p>
@@ -21226,7 +21226,7 @@
         <w:rPr>
           <w:b w:val="0"/>
         </w:rPr>
-        <w:t>Hedge funds appeal to me because the distance between an idea and its consequences is short: a research view becomes a position, and the position is marked every day. I take that accountability seriously. My lifetime poker winnings of over £40,000 came from respecting variance and sizing risk to a strict 50-buy-in bankroll rule, and as Treasurer of the Agricapital Society, which I helped grow to 126 members, I manage its budget and accounts.</w:t>
+        <w:t>Hedge funds appeal to me because the distance between an idea and its consequences is short: a research view becomes a position, and the position is marked every day. I take that accountability seriously. As Vice-President and then President of the Strathclyde Poker Society, I taught new members to use the Kelly criterion to work out how many buy-ins their win rate, variance and risk tolerance call for, with a buffer because their edge is only an estimate; a position sized on an uncertain alpha needs the same caution. As Treasurer of the Agricapital Society, which I helped grow to 126 members, I manage its budget and accounts.</w:t>
       </w:r>
     </w:p>
     <w:p>
@@ -21472,7 +21472,7 @@
         <w:rPr>
           <w:b w:val="0"/>
         </w:rPr>
-        <w:t>Most of what I am proudest of comes down to good decisions made with incomplete information. My lifetime poker cash-game winnings of over £40,000 came from expected-value reasoning, disciplined bet sizing and a strict 50-buy-in bankroll rule. I also finished 14th at the Irish U19 Chess Championships in 2023 and won 21 of 22 games in a simultaneous exhibition against players with an average FIDE rating of 1860. As Vice-President and then President of the Strathclyde Poker Society, I ran weekly tournaments for around 60 players on a £600-per-semester budget, reconciling every buy-in and prize pool.</w:t>
+        <w:t>Most of what I am proudest of comes down to good decisions made with incomplete information. Playing 12 poker tables at once, I based every decision on expected value and set my stakes with the Kelly criterion, keeping at least 50 buy-ins because an edge estimated from my own results could be overstated. I also finished 14th at the Irish U19 Chess Championships in 2023 and won 21 of 22 games in a simultaneous exhibition against players with an average FIDE rating of 1860. As Vice-President and then President of the Strathclyde Poker Society, I ran weekly tournaments for around 60 players on a £600 budget per semester and taught new members to use the same method to work out how many buy-ins their own win rate, variance and risk tolerance call for.</w:t>
       </w:r>
     </w:p>
     <w:p>
@@ -21729,7 +21729,7 @@
         <w:rPr>
           <w:b w:val="0"/>
         </w:rPr>
-        <w:t>Most of what I am proudest of comes down to good decisions made with incomplete information. My lifetime poker cash-game winnings of over £40,000 came from expected-value reasoning, disciplined bet sizing and a strict 50-buy-in bankroll rule. I also finished 14th at the Irish U19 Chess Championships in 2023 and won 21 of 22 games in a simultaneous exhibition against players with an average FIDE rating of 1860. As Vice-President and then President of the Strathclyde Poker Society, I ran weekly tournaments for around 60 players on a £600-per-semester budget, reconciling every buy-in and prize pool.</w:t>
+        <w:t>Most of what I am proudest of comes down to good decisions made with incomplete information. Playing 12 poker tables at once, I based every decision on expected value and set my stakes with the Kelly criterion, keeping at least 50 buy-ins because an edge estimated from my own results could be overstated. I also finished 14th at the Irish U19 Chess Championships in 2023 and won 21 of 22 games in a simultaneous exhibition against players with an average FIDE rating of 1860. As Vice-President and then President of the Strathclyde Poker Society, I ran weekly tournaments for around 60 players on a £600 budget per semester and taught new members to use the same method to work out how many buy-ins their own win rate, variance and risk tolerance call for.</w:t>
       </w:r>
     </w:p>
     <w:p>
@@ -21986,7 +21986,7 @@
         <w:rPr>
           <w:b w:val="0"/>
         </w:rPr>
-        <w:t>Most of what I am proudest of comes down to good decisions made with incomplete information. My lifetime poker cash-game winnings of over £40,000 came from expected-value reasoning, disciplined bet sizing and a strict 50-buy-in bankroll rule. I also finished 14th at the Irish U19 Chess Championships in 2023 and won 21 of 22 games in a simultaneous exhibition against players with an average FIDE rating of 1860. As Vice-President and then President of the Strathclyde Poker Society, I ran weekly tournaments for around 60 players on a £600-per-semester budget, reconciling every buy-in and prize pool.</w:t>
+        <w:t>Most of what I am proudest of comes down to good decisions made with incomplete information. Playing 12 poker tables at once, I based every decision on expected value and set my stakes with the Kelly criterion, keeping at least 50 buy-ins because an edge estimated from my own results could be overstated. I also finished 14th at the Irish U19 Chess Championships in 2023 and won 21 of 22 games in a simultaneous exhibition against players with an average FIDE rating of 1860. As Vice-President and then President of the Strathclyde Poker Society, I ran weekly tournaments for around 60 players on a £600 budget per semester and taught new members to use the same method to work out how many buy-ins their own win rate, variance and risk tolerance call for.</w:t>
       </w:r>
     </w:p>
     <w:p>
@@ -22243,7 +22243,7 @@
         <w:rPr>
           <w:b w:val="0"/>
         </w:rPr>
-        <w:t>Most of what I am proudest of comes down to good decisions made with incomplete information. My lifetime poker cash-game winnings of over £40,000 came from expected-value reasoning, disciplined bet sizing and a strict 50-buy-in bankroll rule. I also finished 14th at the Irish U19 Chess Championships in 2023 and won 21 of 22 games in a simultaneous exhibition against players with an average FIDE rating of 1860. As Vice-President and then President of the Strathclyde Poker Society, I ran weekly tournaments for around 60 players on a £600-per-semester budget, reconciling every buy-in and prize pool.</w:t>
+        <w:t>Most of what I am proudest of comes down to good decisions made with incomplete information. Playing 12 poker tables at once, I based every decision on expected value and set my stakes with the Kelly criterion, keeping at least 50 buy-ins because an edge estimated from my own results could be overstated. I also finished 14th at the Irish U19 Chess Championships in 2023 and won 21 of 22 games in a simultaneous exhibition against players with an average FIDE rating of 1860. As Vice-President and then President of the Strathclyde Poker Society, I ran weekly tournaments for around 60 players on a £600 budget per semester and taught new members to use the same method to work out how many buy-ins their own win rate, variance and risk tolerance call for.</w:t>
       </w:r>
     </w:p>
     <w:p>
@@ -22500,7 +22500,7 @@
         <w:rPr>
           <w:b w:val="0"/>
         </w:rPr>
-        <w:t>Most of what I am proudest of comes down to good decisions made with incomplete information. My lifetime poker cash-game winnings of over £40,000 came from expected-value reasoning, disciplined bet sizing and a strict 50-buy-in bankroll rule. I also finished 14th at the Irish U19 Chess Championships in 2023 and won 21 of 22 games in a simultaneous exhibition against players with an average FIDE rating of 1860. As Vice-President and then President of the Strathclyde Poker Society, I ran weekly tournaments for around 60 players on a £600-per-semester budget, reconciling every buy-in and prize pool.</w:t>
+        <w:t>Most of what I am proudest of comes down to good decisions made with incomplete information. Playing 12 poker tables at once, I based every decision on expected value and set my stakes with the Kelly criterion, keeping at least 50 buy-ins because an edge estimated from my own results could be overstated. I also finished 14th at the Irish U19 Chess Championships in 2023 and won 21 of 22 games in a simultaneous exhibition against players with an average FIDE rating of 1860. As Vice-President and then President of the Strathclyde Poker Society, I ran weekly tournaments for around 60 players on a £600 budget per semester and taught new members to use the same method to work out how many buy-ins their own win rate, variance and risk tolerance call for.</w:t>
       </w:r>
     </w:p>
     <w:p>

</xml_diff>